<commit_message>
Protect head_admin accounts, route feedback questions to comments, fix overall avg; update manual
- adminController: head_admin can no longer change role, suspend, or delete
  another head_admin (403); tests added for all three
- surveyController.stats: overall_avg no longer drops surveys whose real
  average is 0.00 (AVG already ignores NULL)
- DashboardView: feedback-style questions (by question text) are excluded
  from the per-question charts and shown in "ความคิดเห็นล่าสุด" even when
  imported with a categorical type; rename bar-* classes to qbar-*
- scripts/fix-feedback-question-type.js: dry-run/--apply data fix that
  reclassifies mistyped feedback questions to 'para'
- Add push_github.bat; ignore "Claude outputs/"
- README + user manual (23 Sep 2569) updated for the above

Co-Authored-By: Claude Opus 5.5 <noreply@anthropic.com>
Claude-Session: https://claude.ai/code/session_01XTQsBjytCAJcv7svYCuL58
</commit_message>
<xml_diff>
--- a/SurveySmart_คู่มือผู้ใช้งาน.docx
+++ b/SurveySmart_คู่มือผู้ใช้งาน.docx
@@ -80,7 +80,7 @@
           <w:sz w:val="28"/>
           <w:szCs w:val="28"/>
         </w:rPr>
-        <w:t xml:space="preserve">ปรับปรุงล่าสุด: 21 กันยายน 2569</w:t>
+        <w:t>ปรับปรุงล่าสุด: 23 กันยายน 2569</w:t>
       </w:r>
     </w:p>
     <w:p>
@@ -97,7 +97,7 @@
           <w:sz w:val="22"/>
           <w:szCs w:val="22"/>
         </w:rPr>
-        <w:t xml:space="preserve">(ฉบับปรับปรุงจากคู่มือวันที่ 31 สิงหาคม 2569)</w:t>
+        <w:t>(ฉบับปรับปรุงจากคู่มือวันที่ 21 กันยายน 2569)</w:t>
       </w:r>
     </w:p>
     <w:p>
@@ -164,7 +164,7 @@
                 <w:sz w:val="26"/>
                 <w:szCs w:val="26"/>
               </w:rPr>
-              <w:t xml:space="preserve">นำเข้าไฟล์ Excel (.xlsx) ได้แล้ว นอกเหนือจาก CSV ทั้งตอนสร้างแบบสอบถามใหม่และตอนนำเข้าคำตอบ — ปุ่มบนแถบเมนูเปลี่ยนชื่อเป็น "⬇ นำเข้า CSV/Excel" — อ่านหัวข้อ 5.2 และ 9.3</w:t>
+              <w:t>Dashboard ภาพรวม (เมนู 📊 Dashboard) แท็บ "รายคำถาม" จะไม่แสดงคำถามประเภทข้อเสนอแนะ/ความคิดเห็นเป็นกราฟอีกต่อไป แต่จะนำคำตอบไปแสดงในกล่อง "💬 ความคิดเห็นล่าสุด" ของแท็บ "ผู้ตอบล่าสุด" แทน แม้คำถามนั้นจะถูกนำเข้ามาผิดประเภท (เช่น เป็นแบบเลือกตอบ) — อ่านหัวข้อ 11</w:t>
             </w:r>
           </w:p>
           <w:p>
@@ -189,7 +189,7 @@
                 <w:sz w:val="26"/>
                 <w:szCs w:val="26"/>
               </w:rPr>
-              <w:t xml:space="preserve">เพิ่มขั้นตอน "ดูตัวอย่าง" ก่อนสร้างแบบสอบถามจากไฟล์ ตรวจสอบและแก้ไขข้อความ ประเภท และตัวเลือกของคำถามได้ก่อนสร้างจริง — อ่านหัวข้อ 5.2</w:t>
+              <w:t>เพิ่มการป้องกันบัญชี Head Admin: Head Admin ไม่สามารถเปลี่ยนบทบาท ระงับ หรือลบบัญชีของ Head Admin คนอื่นได้ — อ่านหัวข้อ 13.2</w:t>
             </w:r>
           </w:p>
           <w:p>
@@ -214,7 +214,7 @@
                 <w:sz w:val="26"/>
                 <w:szCs w:val="26"/>
               </w:rPr>
-              <w:t xml:space="preserve">Dashboard ของแบบสอบถามเลือกรูปแบบกราฟรายคำถามได้ (วงกลม / แท่ง / ตาราง) และรายการคำถามที่ใช้กรองแยกเป็นกลุ่ม "ข้อมูลทั่วไป" กับ "คำถามในแบบสอบถาม" — อ่านหัวข้อ 9.2</w:t>
+              <w:t>คะแนนเฉลี่ยรวมในหน้าหลักและ Dashboard คำนวณถูกต้องขึ้น แบบสอบถามที่มีค่าเฉลี่ยจริงเป็น 0.00 จะถูกนับรวมด้วย (เดิมถูกตัดทิ้ง) — อ่านหัวข้อ 14</w:t>
             </w:r>
           </w:p>
           <w:p>
@@ -239,7 +239,7 @@
                 <w:sz w:val="26"/>
                 <w:szCs w:val="26"/>
               </w:rPr>
-              <w:t xml:space="preserve">การแปลงคำตอบแบบเลือกตัวเลือกเป็นคะแนนแม่นยำขึ้น ไม่ขึ้นกับลำดับตัวเลือก และแจ้งเตือนจำนวนคำตอบที่แปลงเป็นคะแนนไม่ได้ตอนนำเข้า — อ่านหัวข้อ 9.3 และ 14</w:t>
+              <w:t>เพิ่มสคริปต์สำหรับผู้ดูแลระบบ แก้ประเภทคำถามข้อเสนอแนะที่ถูกนำเข้าผิดให้เป็น "ย่อหน้า" และสคริปต์ push_github.bat — อ่านหัวข้อ 15.5</w:t>
             </w:r>
           </w:p>
         </w:tc>
@@ -4614,16 +4614,16 @@
           <w:sz w:val="28"/>
           <w:szCs w:val="28"/>
         </w:rPr>
-        <w:t xml:space="preserve">รายคำถาม</w:t>
-      </w:r>
-      <w:r>
-        <w:rPr>
-          <w:rFonts w:ascii="TH Sarabun New" w:cs="TH Sarabun New" w:eastAsia="TH Sarabun New" w:hAnsi="TH Sarabun New"/>
-          <w:color w:val="222222"/>
-          <w:sz w:val="28"/>
-          <w:szCs w:val="28"/>
-        </w:rPr>
-        <w:t xml:space="preserve"> — สรุปผลแยกตามคำถามแต่ละข้อ</w:t>
+        <w:t>รายคำถาม</w:t>
+      </w:r>
+      <w:r>
+        <w:rPr>
+          <w:rFonts w:ascii="TH Sarabun New" w:cs="TH Sarabun New" w:eastAsia="TH Sarabun New" w:hAnsi="TH Sarabun New"/>
+          <w:color w:val="222222"/>
+          <w:sz w:val="28"/>
+          <w:szCs w:val="28"/>
+        </w:rPr>
+        <w:t xml:space="preserve"> — สรุปผลแยกตามคำถามแต่ละข้อ (ไม่รวมคำถามปลายเปิดประเภทข้อเสนอแนะ/ความคิดเห็น ซึ่งจะไปแสดงในแท็บ "ผู้ตอบล่าสุด" แทน)</w:t>
       </w:r>
     </w:p>
     <w:p>
@@ -4644,16 +4644,30 @@
           <w:sz w:val="28"/>
           <w:szCs w:val="28"/>
         </w:rPr>
-        <w:t xml:space="preserve">ผู้ตอบล่าสุด</w:t>
-      </w:r>
-      <w:r>
-        <w:rPr>
-          <w:rFonts w:ascii="TH Sarabun New" w:cs="TH Sarabun New" w:eastAsia="TH Sarabun New" w:hAnsi="TH Sarabun New"/>
-          <w:color w:val="222222"/>
-          <w:sz w:val="28"/>
-          <w:szCs w:val="28"/>
-        </w:rPr>
-        <w:t xml:space="preserve"> — รายชื่อผู้ตอบล่าสุด</w:t>
+        <w:t>ผู้ตอบล่าสุด</w:t>
+      </w:r>
+      <w:r>
+        <w:rPr>
+          <w:rFonts w:ascii="TH Sarabun New" w:cs="TH Sarabun New" w:eastAsia="TH Sarabun New" w:hAnsi="TH Sarabun New"/>
+          <w:color w:val="222222"/>
+          <w:sz w:val="28"/>
+          <w:szCs w:val="28"/>
+        </w:rPr>
+        <w:t xml:space="preserve"> — รายชื่อผู้ตอบล่าสุด และกล่อง "💬 ความคิดเห็นล่าสุด" ที่รวบรวมข้อเสนอแนะจากผู้ตอบ</w:t>
+      </w:r>
+    </w:p>
+    <w:p>
+      <w:pPr>
+        <w:spacing w:after="160" w:line="320"/>
+      </w:pPr>
+      <w:r>
+        <w:rPr>
+          <w:rFonts w:ascii="TH Sarabun New" w:cs="TH Sarabun New" w:eastAsia="TH Sarabun New" w:hAnsi="TH Sarabun New"/>
+          <w:color w:val="222222"/>
+          <w:sz w:val="28"/>
+          <w:szCs w:val="28"/>
+        </w:rPr>
+        <w:t>ระบบจะจัดคำถามเป็นประเภท "ข้อเสนอแนะ/ความคิดเห็น" จากข้อความคำถาม (เช่น มีคำว่า "ข้อเสนอแนะ", "ความคิดเห็น", "ความเห็น", "comment" หรือ "feedback") ไม่ใช่จากประเภทคำตอบที่บันทึกไว้เพียงอย่างเดียว เพื่อให้คำถามที่ถูกนำเข้าจาก CSV/Google Forms แล้วระบบเดาประเภทผิดเป็นแบบเลือกตอบ ยังแสดงคำตอบเป็นความคิดเห็นได้ถูกต้อง ยกเว้นคำถามที่เป็นสเกลให้คะแนนจริง (เช่น "ระดับความคิดเห็นต่อ..." ที่มีตัวเลือก น้อยที่สุด–มากที่สุด) จะยังแสดงเป็นกราฟในแท็บ "รายคำถาม" ตามปกติ</w:t>
       </w:r>
     </w:p>
     <w:p>
@@ -5085,6 +5099,58 @@
         <w:t xml:space="preserve">ลบบัญชีผู้ใช้ถาวร (ยืนยันก่อนลบทุกครั้ง และไม่สามารถย้อนกลับได้)</w:t>
       </w:r>
     </w:p>
+    <w:tbl>
+      <w:tblPr>
+        <w:tblW w:type="pct" w:w="100%"/>
+        <w:tblBorders>
+          <w:top w:val="single" w:color="D2DAE8" w:sz="4"/>
+          <w:left w:val="single" w:color="1A56A0" w:sz="16"/>
+          <w:bottom w:val="single" w:color="D2DAE8" w:sz="4"/>
+          <w:right w:val="single" w:color="D2DAE8" w:sz="4"/>
+          <w:insideH w:val="single" w:color="auto" w:sz="4"/>
+          <w:insideV w:val="single" w:color="auto" w:sz="4"/>
+        </w:tblBorders>
+      </w:tblPr>
+      <w:tblGrid>
+        <w:gridCol w:w="100"/>
+      </w:tblGrid>
+      <w:tr>
+        <w:tc>
+          <w:tcPr>
+            <w:shd w:fill="FDF8EC" w:color="auto" w:val="clear"/>
+            <w:tcMar>
+              <w:top w:type="dxa" w:w="140"/>
+              <w:left w:type="dxa" w:w="220"/>
+              <w:bottom w:type="dxa" w:w="140"/>
+              <w:right w:type="dxa" w:w="220"/>
+            </w:tcMar>
+          </w:tcPr>
+          <w:p>
+            <w:pPr>
+              <w:spacing w:line="300"/>
+            </w:pPr>
+            <w:r>
+              <w:rPr>
+                <w:rFonts w:ascii="TH Sarabun New" w:cs="TH Sarabun New" w:eastAsia="TH Sarabun New" w:hAnsi="TH Sarabun New"/>
+                <w:color w:val="222222"/>
+                <w:sz w:val="26"/>
+                <w:szCs w:val="26"/>
+              </w:rPr>
+              <w:t xml:space="preserve">ℹ️  </w:t>
+            </w:r>
+            <w:r>
+              <w:rPr>
+                <w:rFonts w:ascii="TH Sarabun New" w:cs="TH Sarabun New" w:eastAsia="TH Sarabun New" w:hAnsi="TH Sarabun New"/>
+                <w:color w:val="555555"/>
+                <w:sz w:val="26"/>
+                <w:szCs w:val="26"/>
+              </w:rPr>
+              <w:t>บัญชี Head Admin ไม่สามารถเปลี่ยนบทบาท ระงับการใช้งาน หรือลบบัญชีของ Head Admin คนอื่นได้ (ระบบจะแจ้งว่า "ไม่สามารถ... ของ Head Admin คนอื่นได้") เพื่อป้องกันไม่ให้ Head Admin คนใดคนหนึ่งตัดสิทธิ์ Head Admin คนอื่นได้ฝ่ายเดียว หากจำเป็นต้องเปลี่ยนแปลงบัญชี Head Admin ให้ติดต่อผู้ดูแลฐานข้อมูลโดยตรง</w:t>
+            </w:r>
+          </w:p>
+        </w:tc>
+      </w:tr>
+    </w:tbl>
     <w:p>
       <w:pPr>
         <w:pStyle w:val="Heading2"/>
@@ -5227,6 +5293,51 @@
           <w:szCs w:val="28"/>
         </w:rPr>
         <w:t xml:space="preserve">คำนวณจากคำถามที่มีคะแนน แล้วเฉลี่ยรวมของผู้ตอบทั้งหมดในแบบสอบถามนั้น โดยสเกลเชิงเส้นและคะแนนดาวใช้ตัวเลขที่ผู้ตอบเลือกโดยตรง ส่วนคำถามแบบเลือกตอบ (หลายตัวเลือก/เลื่อนลง) ระบบจะแปลงข้อความตัวเลือกเป็นคะแนน 1–5 จากป้ายคำตอบมาตรฐานภาษาไทย เช่น "น้อยที่สุด → มากที่สุด", "ไม่ดี → ดีมาก" หรือ "ไม่พึงพอใจอย่างยิ่ง → พึงพอใจอย่างยิ่ง" โดยไม่ขึ้นกับลำดับที่เรียงตัวเลือกไว้ หากผู้สร้างระบุคะแนนกำกับท้ายตัวเลือกเอง เช่น "ดีมาก (5)" ระบบจะใช้คะแนนที่ระบุเสมอ ส่วนตัวเลือกที่ไม่ตรงกับป้ายมาตรฐานและไม่มีคะแนนกำกับจะไม่ถูกนำมาคำนวณ</w:t>
+      </w:r>
+    </w:p>
+    <w:p>
+      <w:pPr>
+        <w:spacing w:after="160" w:line="320"/>
+      </w:pPr>
+      <w:r>
+        <w:rPr>
+          <w:rFonts w:ascii="TH Sarabun New" w:cs="TH Sarabun New" w:eastAsia="TH Sarabun New" w:hAnsi="TH Sarabun New"/>
+          <w:color w:val="222222"/>
+          <w:sz w:val="28"/>
+          <w:szCs w:val="28"/>
+        </w:rPr>
+        <w:t>สำหรับ "คะแนนเฉลี่ยรวม" ในหน้าหลักและแถบสรุปของ Dashboard ภาพรวม คือค่าเฉลี่ยของคะแนนเฉลี่ยของทุกแบบสอบถามที่มีผู้ตอบแล้ว แบบสอบถามที่ยังไม่มีผู้ตอบจะไม่ถูกนับ แต่แบบสอบถามที่มีผู้ตอบและได้ค่าเฉลี่ยจริงเป็น 0.00 จะถูกนับรวมด้วย</w:t>
+      </w:r>
+    </w:p>
+    <w:p>
+      <w:pPr>
+        <w:pStyle w:val="Heading3"/>
+        <w:spacing w:after="100" w:before="220"/>
+      </w:pPr>
+      <w:r>
+        <w:rPr>
+          <w:rFonts w:ascii="TH Sarabun New" w:cs="TH Sarabun New" w:eastAsia="TH Sarabun New" w:hAnsi="TH Sarabun New"/>
+          <w:b/>
+          <w:bCs/>
+          <w:color w:val="1B2A4A"/>
+          <w:sz w:val="28"/>
+          <w:szCs w:val="28"/>
+        </w:rPr>
+        <w:t>ทำไมคำถามข้อเสนอแนะไม่แสดงเป็นกราฟในแท็บ "รายคำถาม"?</w:t>
+      </w:r>
+    </w:p>
+    <w:p>
+      <w:pPr>
+        <w:spacing w:after="160" w:line="320"/>
+      </w:pPr>
+      <w:r>
+        <w:rPr>
+          <w:rFonts w:ascii="TH Sarabun New" w:cs="TH Sarabun New" w:eastAsia="TH Sarabun New" w:hAnsi="TH Sarabun New"/>
+          <w:color w:val="222222"/>
+          <w:sz w:val="28"/>
+          <w:szCs w:val="28"/>
+        </w:rPr>
+        <w:t>คำถามปลายเปิดประเภทข้อเสนอแนะ/ความคิดเห็นไม่เหมาะกับการสรุปเป็นกราฟ ระบบจึงนำคำตอบไปแสดงในกล่อง "💬 ความคิดเห็นล่าสุด" ของแท็บ "ผู้ตอบล่าสุด" แทน (ดูหัวข้อ 11) หากคำถามนั้นถูกนำเข้ามาผิดประเภท ผู้ดูแลระบบสามารถแก้ประเภทคำถามในฐานข้อมูลให้ถูกต้องได้ด้วยสคริปต์ในหัวข้อ 15.5 หรือแก้ไขประเภทคำถามเองผ่านปุ่ม "✏️ แก้ไข"</w:t>
       </w:r>
     </w:p>
     <w:p>
@@ -6426,7 +6537,45 @@
           <w:sz w:val="28"/>
           <w:szCs w:val="28"/>
         </w:rPr>
-        <w:t xml:space="preserve">"update_github.bat" ที่โฟลเดอร์หลักของโปรเจกต์ — สคริปต์สำหรับ commit และ push งานขึ้น GitHub อย่างรวดเร็ว</w:t>
+        <w:t>"update_github.bat" ที่โฟลเดอร์หลักของโปรเจกต์ — สคริปต์สำหรับ commit ทุกการเปลี่ยนแปลงและ push งานขึ้น GitHub อย่างรวดเร็ว</w:t>
+      </w:r>
+    </w:p>
+    <w:p>
+      <w:pPr>
+        <w:pStyle w:val="ListParagraph"/>
+        <w:numPr>
+          <w:ilvl w:val="0"/>
+          <w:numId w:val="3"/>
+        </w:numPr>
+        <w:spacing w:after="90" w:line="300"/>
+      </w:pPr>
+      <w:r>
+        <w:rPr>
+          <w:rFonts w:ascii="TH Sarabun New" w:cs="TH Sarabun New" w:eastAsia="TH Sarabun New" w:hAnsi="TH Sarabun New"/>
+          <w:color w:val="222222"/>
+          <w:sz w:val="28"/>
+          <w:szCs w:val="28"/>
+        </w:rPr>
+        <w:t>"push_github.bat" ที่โฟลเดอร์หลักของโปรเจกต์ — push เฉพาะ commit ที่มีอยู่แล้วขึ้น GitHub (ไม่ได้ git add หรือสร้าง commit ใหม่) ใช้เมื่อ commit ไว้แล้วแต่ยังไม่ได้ push</w:t>
+      </w:r>
+    </w:p>
+    <w:p>
+      <w:pPr>
+        <w:pStyle w:val="ListParagraph"/>
+        <w:numPr>
+          <w:ilvl w:val="0"/>
+          <w:numId w:val="3"/>
+        </w:numPr>
+        <w:spacing w:after="90" w:line="300"/>
+      </w:pPr>
+      <w:r>
+        <w:rPr>
+          <w:rFonts w:ascii="TH Sarabun New" w:cs="TH Sarabun New" w:eastAsia="TH Sarabun New" w:hAnsi="TH Sarabun New"/>
+          <w:color w:val="222222"/>
+          <w:sz w:val="28"/>
+          <w:szCs w:val="28"/>
+        </w:rPr>
+        <w:t>"node scripts/fix-feedback-question-type.js" (ในโฟลเดอร์ backend) — ตรวจหาคำถามข้อเสนอแนะ/ความคิดเห็นที่ถูกบันทึกผิดเป็นแบบเลือกตอบ แล้วแก้เป็นประเภท "ย่อหน้า" (ไม่แตะข้อมูลคำตอบ และข้ามคำถามที่เป็นสเกลให้คะแนนจริง) — รันเปล่า ๆ เพื่อดูตัวอย่างก่อน (dry run) เติม "--apply" เพื่อบันทึกจริง และเติม "--survey &lt;id&gt;" เพื่อจำกัดเฉพาะแบบสอบถามเดียว รันซ้ำได้อย่างปลอดภัย</w:t>
       </w:r>
     </w:p>
     <w:p>

</xml_diff>